<commit_message>
Phase F+G: k-drone 3D missions and the full (n,k) baseline sweep
</commit_message>
<xml_diff>
--- a/Thesis Progress.docx
+++ b/Thesis Progress.docx
@@ -3177,6 +3177,404 @@
           <w:szCs w:val="34"/>
           <w:rtl w:val="0"/>
         </w:rPr>
+        <w:t xml:space="preserve">Flying Several Drones at Once</w:t>
+      </w:r>
+    </w:p>
+    <w:p>
+      <w:pPr>
+        <w:rPr/>
+      </w:pPr>
+      <w:r>
+        <w:rPr>
+          <w:rtl w:val="0"/>
+        </w:rPr>
+        <w:t xml:space="preserve">To run k drones at the same time I wrote start_px4_multi.sh. It starts one PX4 instance per drone, all sharing the same Gazebo world, each spawned at its own point from the scenario, with its own MAVLink heartbeat and its own MAVROS bridge in a separate namespace. A second script, run_multi_mission.py, starts one mission node and one collision monitor per drone, waits until every drone has either reached its target or been destroyed, and writes a summary for the whole run.</w:t>
+      </w:r>
+    </w:p>
+    <w:p>
+      <w:pPr>
+        <w:rPr/>
+      </w:pPr>
+      <w:r>
+        <w:rPr>
+          <w:rtl w:val="0"/>
+        </w:rPr>
+        <w:t xml:space="preserve">The collision monitor now also checks each drone against the others. Every monitor publishes its own drone’s position in world coordinates, so each one can see where the others are. A drone that has been destroyed keeps publishing its last position, because the wreck stays where it fell and is still an obstacle for the rest.</w:t>
+      </w:r>
+    </w:p>
+    <w:p>
+      <w:pPr>
+        <w:rPr/>
+      </w:pPr>
+      <w:r>
+        <w:rPr>
+          <w:rtl w:val="0"/>
+        </w:rPr>
+        <w:t xml:space="preserve">Getting three drones to fly took much longer than expected. For a while it looked like the virtual machine was too slow: the PX4 instances reported accelerometer timeouts and the drones fell out of the sky without touching anything. The real cause was something else. PX4 gives instance i the MAVLink system identifier i+1, while MAVROS sends its commands to system 1 unless it is told otherwise, so all three bridges were talking to the first drone. The other two logged “Ignore command 400 from 1/191 to 1/1” and could never arm, and the commands that went unanswered were retried until two replies arrived at once and MAVROS crashed. Giving each MAVROS the system identifier of its own autopilot fixed it.</w:t>
+      </w:r>
+    </w:p>
+    <w:p>
+      <w:pPr>
+        <w:rPr/>
+      </w:pPr>
+      <w:r>
+        <w:rPr>
+          <w:rtl w:val="0"/>
+        </w:rPr>
+        <w:t xml:space="preserve">Two smaller problems came out of the same work. MAVROS cannot be used to set parameters when several drones are running, because it downloads the autopilot’s whole parameter list before it will set anything, and with three instances that download does not finish. The parameters are now sent directly over MAVLink by the heartbeat process instead. And the mission time is now measured from Gazebo’s clock rather than the wall clock, so a machine that cannot keep up produces a longer run in real time but the same simulated result.</w:t>
+      </w:r>
+    </w:p>
+    <w:p>
+      <w:pPr>
+        <w:rPr/>
+      </w:pPr>
+      <w:r>
+        <w:rPr>
+          <w:rtl w:val="0"/>
+        </w:rPr>
+        <w:t xml:space="preserve">With those fixed, three drones fly correctly. In a maze of ten obstacles all three reached their targets, with a summed Euclidean distance of 49.34 m, a summed travelled distance of 54.31 m, a ratio of 1.101 and a simulation time of 11.5 s. Measured while they were flying, Gazebo was running at 0.99 of real time and using about 40 per cent of one processor core out of six, so the machine was never the limit.</w:t>
+      </w:r>
+    </w:p>
+    <w:p>
+      <w:pPr>
+        <w:pStyle w:val="Heading2"/>
+        <w:keepNext w:val="0"/>
+        <w:keepLines w:val="0"/>
+        <w:spacing w:after="80" w:lineRule="auto"/>
+        <w:rPr>
+          <w:b w:val="1"/>
+          <w:bCs w:val="1"/>
+          <w:sz w:val="34"/>
+          <w:szCs w:val="34"/>
+        </w:rPr>
+      </w:pPr>
+      <w:r>
+        <w:rPr>
+          <w:b w:val="1"/>
+          <w:bCs w:val="1"/>
+          <w:sz w:val="34"/>
+          <w:szCs w:val="34"/>
+          <w:rtl w:val="0"/>
+        </w:rPr>
+        <w:t xml:space="preserve">Experiments over Obstacle Count and Drone Count</w:t>
+      </w:r>
+    </w:p>
+    <w:p>
+      <w:pPr>
+        <w:rPr/>
+      </w:pPr>
+      <w:r>
+        <w:rPr>
+          <w:rtl w:val="0"/>
+        </w:rPr>
+        <w:t xml:space="preserve">run_batch_3d.py runs the whole experiment without supervision. For every combination of obstacle count, drone count and random seed it generates the scenario, starts the simulator and the drones, spawns the obstacles, flies the mission, records the results and shuts everything down before the next run. compute_metrics_3d.py then collects all the runs into one table.</w:t>
+      </w:r>
+    </w:p>
+    <w:p>
+      <w:pPr>
+        <w:rPr/>
+      </w:pPr>
+      <w:r>
+        <w:rPr>
+          <w:rtl w:val="0"/>
+        </w:rPr>
+        <w:t xml:space="preserve">I ran n = 4, 8, 12, 16 and 20 obstacles with k = 1, 2 and 3 drones and five random seeds for each combination, which is 75 runs. It took 99 minutes and every run completed. The table below shows the averages for each configuration; the full results are in the repository under results/2026-09-06_3d_sweep.</w:t>
+      </w:r>
+    </w:p>
+    <w:p>
+      <w:pPr>
+        <w:rPr/>
+      </w:pPr>
+    </w:p>
+    <w:p>
+      <w:pPr>
+        <w:rPr/>
+      </w:pPr>
+      <w:r>
+        <w:rPr>
+          <w:rFonts w:ascii="Roboto Mono" w:cs="Roboto Mono" w:eastAsia="Roboto Mono" w:hAnsi="Roboto Mono"/>
+          <w:color w:val="188038"/>
+          <w:rtl w:val="0"/>
+        </w:rPr>
+        <w:t xml:space="preserve">   n   k   reached   coll   ratio  ratio+   cpu(s)</w:t>
+      </w:r>
+    </w:p>
+    <w:p>
+      <w:pPr>
+        <w:rPr/>
+      </w:pPr>
+      <w:r>
+        <w:rPr>
+          <w:rFonts w:ascii="Roboto Mono" w:cs="Roboto Mono" w:eastAsia="Roboto Mono" w:hAnsi="Roboto Mono"/>
+          <w:color w:val="188038"/>
+          <w:rtl w:val="0"/>
+        </w:rPr>
+        <w:t xml:space="preserve">   4   1       3/5    0.4   0.932   1.097       15</w:t>
+      </w:r>
+    </w:p>
+    <w:p>
+      <w:pPr>
+        <w:rPr/>
+      </w:pPr>
+      <w:r>
+        <w:rPr>
+          <w:rFonts w:ascii="Roboto Mono" w:cs="Roboto Mono" w:eastAsia="Roboto Mono" w:hAnsi="Roboto Mono"/>
+          <w:color w:val="188038"/>
+          <w:rtl w:val="0"/>
+        </w:rPr>
+        <w:t xml:space="preserve">   4   2     10/10    0.0   1.097   1.097       32</w:t>
+      </w:r>
+    </w:p>
+    <w:p>
+      <w:pPr>
+        <w:rPr/>
+      </w:pPr>
+      <w:r>
+        <w:rPr>
+          <w:rFonts w:ascii="Roboto Mono" w:cs="Roboto Mono" w:eastAsia="Roboto Mono" w:hAnsi="Roboto Mono"/>
+          <w:color w:val="188038"/>
+          <w:rtl w:val="0"/>
+        </w:rPr>
+        <w:t xml:space="preserve">   4   3      9/15    1.2   0.954   1.097       52</w:t>
+      </w:r>
+    </w:p>
+    <w:p>
+      <w:pPr>
+        <w:rPr/>
+      </w:pPr>
+      <w:r>
+        <w:rPr>
+          <w:rFonts w:ascii="Roboto Mono" w:cs="Roboto Mono" w:eastAsia="Roboto Mono" w:hAnsi="Roboto Mono"/>
+          <w:color w:val="188038"/>
+          <w:rtl w:val="0"/>
+        </w:rPr>
+        <w:t xml:space="preserve">   8   1       3/5    0.4   0.852   1.103       14</w:t>
+      </w:r>
+    </w:p>
+    <w:p>
+      <w:pPr>
+        <w:rPr/>
+      </w:pPr>
+      <w:r>
+        <w:rPr>
+          <w:rFonts w:ascii="Roboto Mono" w:cs="Roboto Mono" w:eastAsia="Roboto Mono" w:hAnsi="Roboto Mono"/>
+          <w:color w:val="188038"/>
+          <w:rtl w:val="0"/>
+        </w:rPr>
+        <w:t xml:space="preserve">   8   2      6/10    0.8   0.865   1.099       30</w:t>
+      </w:r>
+    </w:p>
+    <w:p>
+      <w:pPr>
+        <w:rPr/>
+      </w:pPr>
+      <w:r>
+        <w:rPr>
+          <w:rFonts w:ascii="Roboto Mono" w:cs="Roboto Mono" w:eastAsia="Roboto Mono" w:hAnsi="Roboto Mono"/>
+          <w:color w:val="188038"/>
+          <w:rtl w:val="0"/>
+        </w:rPr>
+        <w:t xml:space="preserve">   8   3      9/15    1.2   0.905   1.098       50</w:t>
+      </w:r>
+    </w:p>
+    <w:p>
+      <w:pPr>
+        <w:rPr/>
+      </w:pPr>
+      <w:r>
+        <w:rPr>
+          <w:rFonts w:ascii="Roboto Mono" w:cs="Roboto Mono" w:eastAsia="Roboto Mono" w:hAnsi="Roboto Mono"/>
+          <w:color w:val="188038"/>
+          <w:rtl w:val="0"/>
+        </w:rPr>
+        <w:t xml:space="preserve">  12   1       2/5    0.6   0.733   1.095       15</w:t>
+      </w:r>
+    </w:p>
+    <w:p>
+      <w:pPr>
+        <w:rPr/>
+      </w:pPr>
+      <w:r>
+        <w:rPr>
+          <w:rFonts w:ascii="Roboto Mono" w:cs="Roboto Mono" w:eastAsia="Roboto Mono" w:hAnsi="Roboto Mono"/>
+          <w:color w:val="188038"/>
+          <w:rtl w:val="0"/>
+        </w:rPr>
+        <w:t xml:space="preserve">  12   2      4/10    1.2   0.736   1.100       33</w:t>
+      </w:r>
+    </w:p>
+    <w:p>
+      <w:pPr>
+        <w:rPr/>
+      </w:pPr>
+      <w:r>
+        <w:rPr>
+          <w:rFonts w:ascii="Roboto Mono" w:cs="Roboto Mono" w:eastAsia="Roboto Mono" w:hAnsi="Roboto Mono"/>
+          <w:color w:val="188038"/>
+          <w:rtl w:val="0"/>
+        </w:rPr>
+        <w:t xml:space="preserve">  12   3      8/15    1.4   0.848   1.104       54</w:t>
+      </w:r>
+    </w:p>
+    <w:p>
+      <w:pPr>
+        <w:rPr/>
+      </w:pPr>
+      <w:r>
+        <w:rPr>
+          <w:rFonts w:ascii="Roboto Mono" w:cs="Roboto Mono" w:eastAsia="Roboto Mono" w:hAnsi="Roboto Mono"/>
+          <w:color w:val="188038"/>
+          <w:rtl w:val="0"/>
+        </w:rPr>
+        <w:t xml:space="preserve">  16   1       1/5    0.8   0.599   1.088       13</w:t>
+      </w:r>
+    </w:p>
+    <w:p>
+      <w:pPr>
+        <w:rPr/>
+      </w:pPr>
+      <w:r>
+        <w:rPr>
+          <w:rFonts w:ascii="Roboto Mono" w:cs="Roboto Mono" w:eastAsia="Roboto Mono" w:hAnsi="Roboto Mono"/>
+          <w:color w:val="188038"/>
+          <w:rtl w:val="0"/>
+        </w:rPr>
+        <w:t xml:space="preserve">  16   2      4/10    1.2   0.740   1.102       34</w:t>
+      </w:r>
+    </w:p>
+    <w:p>
+      <w:pPr>
+        <w:rPr/>
+      </w:pPr>
+      <w:r>
+        <w:rPr>
+          <w:rFonts w:ascii="Roboto Mono" w:cs="Roboto Mono" w:eastAsia="Roboto Mono" w:hAnsi="Roboto Mono"/>
+          <w:color w:val="188038"/>
+          <w:rtl w:val="0"/>
+        </w:rPr>
+        <w:t xml:space="preserve">  16   3      6/15    1.8   0.748   1.106       49</w:t>
+      </w:r>
+    </w:p>
+    <w:p>
+      <w:pPr>
+        <w:rPr/>
+      </w:pPr>
+      <w:r>
+        <w:rPr>
+          <w:rFonts w:ascii="Roboto Mono" w:cs="Roboto Mono" w:eastAsia="Roboto Mono" w:hAnsi="Roboto Mono"/>
+          <w:color w:val="188038"/>
+          <w:rtl w:val="0"/>
+        </w:rPr>
+        <w:t xml:space="preserve">  20   1       1/5    0.8   0.602   1.086       13</w:t>
+      </w:r>
+    </w:p>
+    <w:p>
+      <w:pPr>
+        <w:rPr/>
+      </w:pPr>
+      <w:r>
+        <w:rPr>
+          <w:rFonts w:ascii="Roboto Mono" w:cs="Roboto Mono" w:eastAsia="Roboto Mono" w:hAnsi="Roboto Mono"/>
+          <w:color w:val="188038"/>
+          <w:rtl w:val="0"/>
+        </w:rPr>
+        <w:t xml:space="preserve">  20   2      3/10    1.4   0.699   1.103       30</w:t>
+      </w:r>
+    </w:p>
+    <w:p>
+      <w:pPr>
+        <w:rPr/>
+      </w:pPr>
+      <w:r>
+        <w:rPr>
+          <w:rFonts w:ascii="Roboto Mono" w:cs="Roboto Mono" w:eastAsia="Roboto Mono" w:hAnsi="Roboto Mono"/>
+          <w:color w:val="188038"/>
+          <w:rtl w:val="0"/>
+        </w:rPr>
+        <w:t xml:space="preserve">  20   3      5/15    2.0   0.733   1.110       50</w:t>
+      </w:r>
+    </w:p>
+    <w:p>
+      <w:pPr>
+        <w:rPr/>
+      </w:pPr>
+    </w:p>
+    <w:p>
+      <w:pPr>
+        <w:rPr/>
+      </w:pPr>
+      <w:r>
+        <w:rPr>
+          <w:rtl w:val="0"/>
+        </w:rPr>
+        <w:t xml:space="preserve">Collisions per run go up with the number of obstacles at every drone count, and the share of drones that reach their target goes down. Since there is no avoidance in these runs, this is the baseline that the avoidance component has to be compared against.</w:t>
+      </w:r>
+    </w:p>
+    <w:p>
+      <w:pPr>
+        <w:rPr/>
+      </w:pPr>
+      <w:r>
+        <w:rPr>
+          <w:rtl w:val="0"/>
+        </w:rPr>
+        <w:t xml:space="preserve">The two ratio columns need explaining. The first is over all the drones, as agreed. It falls from 0.93 to 0.60 as the maze gets denser, but that is not the paths getting shorter. A drone that is destroyed halfway contributes the distance it managed against the full distance it was asked to fly. The second ratio is over only the drones that arrive, and it stays between 1.086 and 1.110 in all fifteen configurations. Without avoidance the drones fly almost in a straight line, so all of the degradation is in how many of them survive and none of it in the length of the paths. The second number is the one the avoidance component should change.</w:t>
+      </w:r>
+    </w:p>
+    <w:p>
+      <w:pPr>
+        <w:rPr/>
+      </w:pPr>
+      <w:r>
+        <w:rPr>
+          <w:rtl w:val="0"/>
+        </w:rPr>
+        <w:t xml:space="preserve">The CPU time depends on the number of drones and not on the number of obstacles, at about 14, 32 and 50 seconds per run for one, two and three drones.</w:t>
+      </w:r>
+    </w:p>
+    <w:p>
+      <w:pPr>
+        <w:rPr/>
+      </w:pPr>
+      <w:r>
+        <w:rPr>
+          <w:rtl w:val="0"/>
+        </w:rPr>
+        <w:t xml:space="preserve">Collisions between two drones happened as well, at four obstacles with three drones and at eight obstacles with three drones, but not in the denser mazes. With few obstacles the drones fly straighter and cross each other more often, while in a dense maze they are usually destroyed by an obstacle before they can meet.</w:t>
+      </w:r>
+    </w:p>
+    <w:p>
+      <w:pPr>
+        <w:rPr/>
+      </w:pPr>
+      <w:r>
+        <w:rPr>
+          <w:rtl w:val="0"/>
+        </w:rPr>
+        <w:t xml:space="preserve">The scenario generator draws the drone start and target points from the seed before it places the obstacles, so the same seed gives the same missions at every obstacle count. The summed Euclidean distance is therefore identical down each column, 21.5, 37.6 and 53.3 m for one, two and three drones, and only the obstacle density changes between the rows.</w:t>
+      </w:r>
+    </w:p>
+    <w:p>
+      <w:pPr>
+        <w:pStyle w:val="Heading2"/>
+        <w:keepNext w:val="0"/>
+        <w:keepLines w:val="0"/>
+        <w:spacing w:after="80" w:lineRule="auto"/>
+        <w:rPr>
+          <w:b w:val="1"/>
+          <w:bCs w:val="1"/>
+          <w:sz w:val="34"/>
+          <w:szCs w:val="34"/>
+        </w:rPr>
+      </w:pPr>
+      <w:r>
+        <w:rPr>
+          <w:b w:val="1"/>
+          <w:bCs w:val="1"/>
+          <w:sz w:val="34"/>
+          <w:szCs w:val="34"/>
+          <w:rtl w:val="0"/>
+        </w:rPr>
         <w:t xml:space="preserve">Next Steps</w:t>
       </w:r>
     </w:p>
@@ -3188,7 +3586,7 @@
         <w:rPr>
           <w:rtl w:val="0"/>
         </w:rPr>
-        <w:t xml:space="preserve">The next phase adds multiple drones flying at the same time, each with its own target and each able to collide with the obstacles and with the other drones, with a run ending when every drone has either arrived or been destroyed. After that the batch runner and metrics will be extended to sweep combinations of obstacle count and drone count and report, for each (n, k) configuration, the number of collisions, the summed Euclidean and travelled distances, their ratio, the simulation time and the CPU time. Running several PX4 instances together with Gazebo is likely to exceed the memory of my virtual machine, so the larger experiments will probably be run on a more powerful computer. The project already runs unchanged on other machines.</w:t>
+        <w:t xml:space="preserve">What is left is the avoidance itself. Since PX4 has no 3D planner to install, everything measured so far is the baseline without avoidance, and the contribution of the thesis is the component that closes that gap. The measurement side is already finished, so adding it means changing one thing: the mission node currently sends a setpoint straight at the target, and that is the only place where a path is decided. The comparison would then use the same generator, the same seeds and the same metrics, so the two sets of results can be compared directly. Before starting I want to confirm the approach, because the original plan was to install PX4’s own avoidance system and that is no longer possible.</w:t>
       </w:r>
     </w:p>
     <w:p>

</xml_diff>

<commit_message>
Stage 3: RL avoidance policy and the with/without comparison sweep
</commit_message>
<xml_diff>
--- a/Thesis Progress.docx
+++ b/Thesis Progress.docx
@@ -3575,6 +3575,535 @@
           <w:szCs w:val="34"/>
           <w:rtl w:val="0"/>
         </w:rPr>
+        <w:t xml:space="preserve">Avoidance with Reinforcement Learning</w:t>
+      </w:r>
+    </w:p>
+    <w:p>
+      <w:pPr>
+        <w:rPr/>
+      </w:pPr>
+      <w:r>
+        <w:rPr>
+          <w:rtl w:val="0"/>
+        </w:rPr>
+        <w:t xml:space="preserve">Following the feedback, the avoidance component is a neural network trained with reinforcement learning. Its input is a lidar scan together with the target, and its output is the direction in which the drone should move. I used a lidar instead of a camera, because camera images have to be rendered by the simulator and rendering does not work in my virtual machine, which is the same reason the first stage needed a virtual lidar. For the training I used PPO from the Stable-Baselines3 library, which is an actor-critic method.</w:t>
+      </w:r>
+    </w:p>
+    <w:p>
+      <w:pPr>
+        <w:rPr/>
+      </w:pPr>
+      <w:r>
+        <w:rPr>
+          <w:rtl w:val="0"/>
+        </w:rPr>
+        <w:t xml:space="preserve">The network cannot be trained in Gazebo with PX4. A single flight takes about a minute, and the training needs hundreds of thousands of decisions. So it is trained in MuJoCo, using the MuJoCo-Drones-Gym package, and afterwards flown in Gazebo with PX4 without any more training. This only works if the network gets the same input in both simulators and its output means the same thing in both.</w:t>
+      </w:r>
+    </w:p>
+    <w:p>
+      <w:pPr>
+        <w:pStyle w:val="Heading2"/>
+        <w:keepNext w:val="0"/>
+        <w:keepLines w:val="0"/>
+        <w:spacing w:after="80" w:lineRule="auto"/>
+        <w:rPr>
+          <w:b w:val="1"/>
+          <w:bCs w:val="1"/>
+          <w:sz w:val="34"/>
+          <w:szCs w:val="34"/>
+        </w:rPr>
+      </w:pPr>
+      <w:r>
+        <w:rPr>
+          <w:b w:val="1"/>
+          <w:bCs w:val="1"/>
+          <w:sz w:val="34"/>
+          <w:szCs w:val="34"/>
+          <w:rtl w:val="0"/>
+        </w:rPr>
+        <w:t xml:space="preserve">The Lidar and the Training Environment</w:t>
+      </w:r>
+    </w:p>
+    <w:p>
+      <w:pPr>
+        <w:rPr/>
+      </w:pPr>
+      <w:r>
+        <w:rPr>
+          <w:rtl w:val="0"/>
+        </w:rPr>
+        <w:t xml:space="preserve">The lidar is computed by my own code, in the same way as the virtual lidar of the first stage but in three dimensions. It casts 82 rays: 16 directions around the drone at five elevations between -60 and 60 degrees, plus one straight up and one straight down. Each ray is intersected with the obstacle boxes, the ground and the other drones, up to a range of 10 m. Since the same function runs during the training in MuJoCo and during the flights in Gazebo, the network sees the same scan in both. I tested it against distances worked out by hand and with a geometric check over 200 random mazes. Besides the 82 distances, the network receives the direction and distance to the target, its own velocity and its altitude.</w:t>
+      </w:r>
+    </w:p>
+    <w:p>
+      <w:pPr>
+        <w:rPr/>
+      </w:pPr>
+      <w:r>
+        <w:rPr>
+          <w:rtl w:val="0"/>
+        </w:rPr>
+        <w:t xml:space="preserve">The training environment gives the drone a new random maze in every episode, made by the same generator as the Gazebo experiments with 0 to 20 obstacles, so the training mazes and the evaluation mazes come from the same distribution. The reward is the progress towards the target, minus a small cost per step, a penalty for flying within 1 m of an obstacle and a large penalty for a collision, plus a bonus for arriving. Collisions are judged with the same geometric rule as the collision monitor in Gazebo.</w:t>
+      </w:r>
+    </w:p>
+    <w:p>
+      <w:pPr>
+        <w:rPr/>
+      </w:pPr>
+      <w:r>
+        <w:rPr>
+          <w:rtl w:val="0"/>
+        </w:rPr>
+        <w:t xml:space="preserve">While building the environment I found a bug in MuJoCo-Drones-Gym. In its waypoint mode it creates a new position controller at every control step, so the controller loses its state, the attitude oscillates more and more, and the drone flips over. Hovering and climbing straight up still work, which makes the problem easy to miss. I worked around it by calling the package’s controller myself and keeping one controller for the whole episode. With this fix, a drone flying straight in MuJoCo gives the same result as in Gazebo in all 25 single-drone scenarios of the baseline: the same drones crash and the clearances are almost identical. Because of this check I think it is valid to train in one simulator and test in the other.</w:t>
+      </w:r>
+    </w:p>
+    <w:p>
+      <w:pPr>
+        <w:pStyle w:val="Heading2"/>
+        <w:keepNext w:val="0"/>
+        <w:keepLines w:val="0"/>
+        <w:spacing w:after="80" w:lineRule="auto"/>
+        <w:rPr>
+          <w:b w:val="1"/>
+          <w:bCs w:val="1"/>
+          <w:sz w:val="34"/>
+          <w:szCs w:val="34"/>
+        </w:rPr>
+      </w:pPr>
+      <w:r>
+        <w:rPr>
+          <w:b w:val="1"/>
+          <w:bCs w:val="1"/>
+          <w:sz w:val="34"/>
+          <w:szCs w:val="34"/>
+          <w:rtl w:val="0"/>
+        </w:rPr>
+        <w:t xml:space="preserve">Training</w:t>
+      </w:r>
+    </w:p>
+    <w:p>
+      <w:pPr>
+        <w:rPr/>
+      </w:pPr>
+      <w:r>
+        <w:rPr>
+          <w:rtl w:val="0"/>
+        </w:rPr>
+        <w:t xml:space="preserve">I trained with four environments in parallel for 2 million decisions, which took 31 minutes in the virtual machine. During the training the policy was tested regularly on 100 mazes it never trains on, and the best version was kept. In a first attempt the policy improved and then got worse again as the training went on. A learning rate that decreases during the training and a limit on how much the policy can change in one update solved this. The final policy reaches the target in 92 of the 100 test mazes in MuJoCo, where flying straight reaches 51.</w:t>
+      </w:r>
+    </w:p>
+    <w:p>
+      <w:pPr>
+        <w:pStyle w:val="Heading2"/>
+        <w:keepNext w:val="0"/>
+        <w:keepLines w:val="0"/>
+        <w:spacing w:after="80" w:lineRule="auto"/>
+        <w:rPr>
+          <w:b w:val="1"/>
+          <w:bCs w:val="1"/>
+          <w:sz w:val="34"/>
+          <w:szCs w:val="34"/>
+        </w:rPr>
+      </w:pPr>
+      <w:r>
+        <w:rPr>
+          <w:b w:val="1"/>
+          <w:bCs w:val="1"/>
+          <w:sz w:val="34"/>
+          <w:szCs w:val="34"/>
+          <w:rtl w:val="0"/>
+        </w:rPr>
+        <w:t xml:space="preserve">Flying the Policy in PX4</w:t>
+      </w:r>
+    </w:p>
+    <w:p>
+      <w:pPr>
+        <w:rPr/>
+      </w:pPr>
+      <w:r>
+        <w:rPr>
+          <w:rtl w:val="0"/>
+        </w:rPr>
+        <w:t xml:space="preserve">The mission node has a new option that uses the policy. After the climb it builds the same input from the scenario’s obstacles and the positions of the other drones, runs the network every 0.104 s, and sends the direction to PX4 as an offboard velocity setpoint, at the same speed as in training (1.04 m/s horizontally and 1.17 m/s vertically). Without the option the drone flies straight as before, so both cases go through the same code and the same measurements. I checked that the input built during a flight is identical to the one in training: over 5,081 decisions the largest difference was zero.</w:t>
+      </w:r>
+    </w:p>
+    <w:p>
+      <w:pPr>
+        <w:rPr/>
+      </w:pPr>
+      <w:r>
+        <w:rPr>
+          <w:rtl w:val="0"/>
+        </w:rPr>
+        <w:t xml:space="preserve">Before the experiments a system update changed MAVROS from version 2.14 to 2.16, which moved its topics to a different place, so none of the drones could arm. The nodes now look up where MAVROS publishes instead of assuming it. Because the software had changed, I also repeated the baseline sweep instead of reusing the September results.</w:t>
+      </w:r>
+    </w:p>
+    <w:p>
+      <w:pPr>
+        <w:pStyle w:val="Heading2"/>
+        <w:keepNext w:val="0"/>
+        <w:keepLines w:val="0"/>
+        <w:spacing w:after="80" w:lineRule="auto"/>
+        <w:rPr>
+          <w:b w:val="1"/>
+          <w:bCs w:val="1"/>
+          <w:sz w:val="34"/>
+          <w:szCs w:val="34"/>
+        </w:rPr>
+      </w:pPr>
+      <w:r>
+        <w:rPr>
+          <w:b w:val="1"/>
+          <w:bCs w:val="1"/>
+          <w:sz w:val="34"/>
+          <w:szCs w:val="34"/>
+          <w:rtl w:val="0"/>
+        </w:rPr>
+        <w:t xml:space="preserve">Experiments with and without Avoidance</w:t>
+      </w:r>
+    </w:p>
+    <w:p>
+      <w:pPr>
+        <w:rPr/>
+      </w:pPr>
+      <w:r>
+        <w:rPr>
+          <w:rtl w:val="0"/>
+        </w:rPr>
+        <w:t xml:space="preserve">Both sweeps were run on the same day with the same 75 scenarios as before: 4 to 20 obstacles, 1 to 3 drones and five seeds. The repeated baseline matches the September one: 72 of the 75 runs have the same result and the totals are the same. The other three differ only in collisions between drones, which depend on small differences in timing.</w:t>
+      </w:r>
+    </w:p>
+    <w:p>
+      <w:pPr>
+        <w:rPr/>
+      </w:pPr>
+    </w:p>
+    <w:p>
+      <w:pPr>
+        <w:rPr/>
+      </w:pPr>
+      <w:r>
+        <w:rPr>
+          <w:rFonts w:ascii="Roboto Mono" w:cs="Roboto Mono" w:eastAsia="Roboto Mono" w:hAnsi="Roboto Mono"/>
+          <w:color w:val="188038"/>
+          <w:rtl w:val="0"/>
+        </w:rPr>
+        <w:t xml:space="preserve">   n   k            reached   collisions/run           ratio+</w:t>
+      </w:r>
+    </w:p>
+    <w:p>
+      <w:pPr>
+        <w:rPr/>
+      </w:pPr>
+      <w:r>
+        <w:rPr>
+          <w:rFonts w:ascii="Roboto Mono" w:cs="Roboto Mono" w:eastAsia="Roboto Mono" w:hAnsi="Roboto Mono"/>
+          <w:color w:val="188038"/>
+          <w:rtl w:val="0"/>
+        </w:rPr>
+        <w:t xml:space="preserve">          straight   policy  straight policy  straight policy</w:t>
+      </w:r>
+    </w:p>
+    <w:p>
+      <w:pPr>
+        <w:rPr/>
+      </w:pPr>
+      <w:r>
+        <w:rPr>
+          <w:rFonts w:ascii="Roboto Mono" w:cs="Roboto Mono" w:eastAsia="Roboto Mono" w:hAnsi="Roboto Mono"/>
+          <w:color w:val="188038"/>
+          <w:rtl w:val="0"/>
+        </w:rPr>
+        <w:t xml:space="preserve">   4   1       3/5      4/5       0.4    0.2     1.105  1.128</w:t>
+      </w:r>
+    </w:p>
+    <w:p>
+      <w:pPr>
+        <w:rPr/>
+      </w:pPr>
+      <w:r>
+        <w:rPr>
+          <w:rFonts w:ascii="Roboto Mono" w:cs="Roboto Mono" w:eastAsia="Roboto Mono" w:hAnsi="Roboto Mono"/>
+          <w:color w:val="188038"/>
+          <w:rtl w:val="0"/>
+        </w:rPr>
+        <w:t xml:space="preserve">   4   2     10/10    10/10       0.0    0.0     1.097  1.127</w:t>
+      </w:r>
+    </w:p>
+    <w:p>
+      <w:pPr>
+        <w:rPr/>
+      </w:pPr>
+      <w:r>
+        <w:rPr>
+          <w:rFonts w:ascii="Roboto Mono" w:cs="Roboto Mono" w:eastAsia="Roboto Mono" w:hAnsi="Roboto Mono"/>
+          <w:color w:val="188038"/>
+          <w:rtl w:val="0"/>
+        </w:rPr>
+        <w:t xml:space="preserve">   4   3     11/15    14/15       0.8    0.2     1.097  1.166</w:t>
+      </w:r>
+    </w:p>
+    <w:p>
+      <w:pPr>
+        <w:rPr/>
+      </w:pPr>
+      <w:r>
+        <w:rPr>
+          <w:rFonts w:ascii="Roboto Mono" w:cs="Roboto Mono" w:eastAsia="Roboto Mono" w:hAnsi="Roboto Mono"/>
+          <w:color w:val="188038"/>
+          <w:rtl w:val="0"/>
+        </w:rPr>
+        <w:t xml:space="preserve">   8   1       3/5      5/5       0.4    0.0     1.099  1.137</w:t>
+      </w:r>
+    </w:p>
+    <w:p>
+      <w:pPr>
+        <w:rPr/>
+      </w:pPr>
+      <w:r>
+        <w:rPr>
+          <w:rFonts w:ascii="Roboto Mono" w:cs="Roboto Mono" w:eastAsia="Roboto Mono" w:hAnsi="Roboto Mono"/>
+          <w:color w:val="188038"/>
+          <w:rtl w:val="0"/>
+        </w:rPr>
+        <w:t xml:space="preserve">   8   2      5/10     9/10       1.0    0.2     1.102  1.150</w:t>
+      </w:r>
+    </w:p>
+    <w:p>
+      <w:pPr>
+        <w:rPr/>
+      </w:pPr>
+      <w:r>
+        <w:rPr>
+          <w:rFonts w:ascii="Roboto Mono" w:cs="Roboto Mono" w:eastAsia="Roboto Mono" w:hAnsi="Roboto Mono"/>
+          <w:color w:val="188038"/>
+          <w:rtl w:val="0"/>
+        </w:rPr>
+        <w:t xml:space="preserve">   8   3      8/15    15/15       1.4    0.0     1.095  1.205</w:t>
+      </w:r>
+    </w:p>
+    <w:p>
+      <w:pPr>
+        <w:rPr/>
+      </w:pPr>
+      <w:r>
+        <w:rPr>
+          <w:rFonts w:ascii="Roboto Mono" w:cs="Roboto Mono" w:eastAsia="Roboto Mono" w:hAnsi="Roboto Mono"/>
+          <w:color w:val="188038"/>
+          <w:rtl w:val="0"/>
+        </w:rPr>
+        <w:t xml:space="preserve">  12   1       2/5      5/5       0.6    0.0     1.092  1.155</w:t>
+      </w:r>
+    </w:p>
+    <w:p>
+      <w:pPr>
+        <w:rPr/>
+      </w:pPr>
+      <w:r>
+        <w:rPr>
+          <w:rFonts w:ascii="Roboto Mono" w:cs="Roboto Mono" w:eastAsia="Roboto Mono" w:hAnsi="Roboto Mono"/>
+          <w:color w:val="188038"/>
+          <w:rtl w:val="0"/>
+        </w:rPr>
+        <w:t xml:space="preserve">  12   2      4/10     9/10       1.2    0.2     1.103  1.171</w:t>
+      </w:r>
+    </w:p>
+    <w:p>
+      <w:pPr>
+        <w:rPr/>
+      </w:pPr>
+      <w:r>
+        <w:rPr>
+          <w:rFonts w:ascii="Roboto Mono" w:cs="Roboto Mono" w:eastAsia="Roboto Mono" w:hAnsi="Roboto Mono"/>
+          <w:color w:val="188038"/>
+          <w:rtl w:val="0"/>
+        </w:rPr>
+        <w:t xml:space="preserve">  12   3      8/15    13/15       1.4    0.4     1.102  1.253</w:t>
+      </w:r>
+    </w:p>
+    <w:p>
+      <w:pPr>
+        <w:rPr/>
+      </w:pPr>
+      <w:r>
+        <w:rPr>
+          <w:rFonts w:ascii="Roboto Mono" w:cs="Roboto Mono" w:eastAsia="Roboto Mono" w:hAnsi="Roboto Mono"/>
+          <w:color w:val="188038"/>
+          <w:rtl w:val="0"/>
+        </w:rPr>
+        <w:t xml:space="preserve">  16   1       1/5      5/5       0.8    0.0     1.091  1.172</w:t>
+      </w:r>
+    </w:p>
+    <w:p>
+      <w:pPr>
+        <w:rPr/>
+      </w:pPr>
+      <w:r>
+        <w:rPr>
+          <w:rFonts w:ascii="Roboto Mono" w:cs="Roboto Mono" w:eastAsia="Roboto Mono" w:hAnsi="Roboto Mono"/>
+          <w:color w:val="188038"/>
+          <w:rtl w:val="0"/>
+        </w:rPr>
+        <w:t xml:space="preserve">  16   2      4/10    10/10       1.2    0.0     1.104  1.180</w:t>
+      </w:r>
+    </w:p>
+    <w:p>
+      <w:pPr>
+        <w:rPr/>
+      </w:pPr>
+      <w:r>
+        <w:rPr>
+          <w:rFonts w:ascii="Roboto Mono" w:cs="Roboto Mono" w:eastAsia="Roboto Mono" w:hAnsi="Roboto Mono"/>
+          <w:color w:val="188038"/>
+          <w:rtl w:val="0"/>
+        </w:rPr>
+        <w:t xml:space="preserve">  16   3      6/15    11/15       1.8    0.8     1.104  1.294</w:t>
+      </w:r>
+    </w:p>
+    <w:p>
+      <w:pPr>
+        <w:rPr/>
+      </w:pPr>
+      <w:r>
+        <w:rPr>
+          <w:rFonts w:ascii="Roboto Mono" w:cs="Roboto Mono" w:eastAsia="Roboto Mono" w:hAnsi="Roboto Mono"/>
+          <w:color w:val="188038"/>
+          <w:rtl w:val="0"/>
+        </w:rPr>
+        <w:t xml:space="preserve">  20   1       1/5      5/5       0.8    0.0     1.090  1.273</w:t>
+      </w:r>
+    </w:p>
+    <w:p>
+      <w:pPr>
+        <w:rPr/>
+      </w:pPr>
+      <w:r>
+        <w:rPr>
+          <w:rFonts w:ascii="Roboto Mono" w:cs="Roboto Mono" w:eastAsia="Roboto Mono" w:hAnsi="Roboto Mono"/>
+          <w:color w:val="188038"/>
+          <w:rtl w:val="0"/>
+        </w:rPr>
+        <w:t xml:space="preserve">  20   2      3/10     9/10       1.4    0.2     1.102  1.209</w:t>
+      </w:r>
+    </w:p>
+    <w:p>
+      <w:pPr>
+        <w:rPr/>
+      </w:pPr>
+      <w:r>
+        <w:rPr>
+          <w:rFonts w:ascii="Roboto Mono" w:cs="Roboto Mono" w:eastAsia="Roboto Mono" w:hAnsi="Roboto Mono"/>
+          <w:color w:val="188038"/>
+          <w:rtl w:val="0"/>
+        </w:rPr>
+        <w:t xml:space="preserve">  20   3      5/15    11/15       2.0    0.8     1.109  1.335</w:t>
+      </w:r>
+    </w:p>
+    <w:p>
+      <w:pPr>
+        <w:rPr/>
+      </w:pPr>
+    </w:p>
+    <w:p>
+      <w:pPr>
+        <w:rPr/>
+      </w:pPr>
+      <w:r>
+        <w:rPr>
+          <w:rtl w:val="0"/>
+        </w:rPr>
+        <w:t xml:space="preserve">With the policy, 135 of the 150 drones reach their target instead of 74, so 90% instead of 49%, and the number of destroyed drones falls from 76 to 15. Comparing the same drone in the same scenario, the policy saves 61 drones and does not lose any. Every drone that arrives flying straight also arrives with the policy. The ratio over the drones that arrive is now between 1.13 and 1.34 instead of 1.09 to 1.11, and it grows with the number of obstacles, which means the drones are now flying around the obstacles instead of straight at the target. With the policy there were no collisions between drones (three without it), and no two drones came closer than 2.66 m.</w:t>
+      </w:r>
+    </w:p>
+    <w:p>
+      <w:pPr>
+        <w:rPr/>
+      </w:pPr>
+      <w:r>
+        <w:rPr>
+          <w:rtl w:val="0"/>
+        </w:rPr>
+        <w:t xml:space="preserve">The Gazebo result is also close to what MuJoCo predicted. For the 25 single-drone scenarios MuJoCo predicted 23 arrivals, and Gazebo gave 24.</w:t>
+      </w:r>
+    </w:p>
+    <w:p>
+      <w:pPr>
+        <w:pStyle w:val="Heading2"/>
+        <w:keepNext w:val="0"/>
+        <w:keepLines w:val="0"/>
+        <w:spacing w:after="80" w:lineRule="auto"/>
+        <w:rPr>
+          <w:b w:val="1"/>
+          <w:bCs w:val="1"/>
+          <w:sz w:val="34"/>
+          <w:szCs w:val="34"/>
+        </w:rPr>
+      </w:pPr>
+      <w:r>
+        <w:rPr>
+          <w:b w:val="1"/>
+          <w:bCs w:val="1"/>
+          <w:sz w:val="34"/>
+          <w:szCs w:val="34"/>
+          <w:rtl w:val="0"/>
+        </w:rPr>
+        <w:t xml:space="preserve">Costs and Limitations</w:t>
+      </w:r>
+    </w:p>
+    <w:p>
+      <w:pPr>
+        <w:rPr/>
+      </w:pPr>
+      <w:r>
+        <w:rPr>
+          <w:rtl w:val="0"/>
+        </w:rPr>
+        <w:t xml:space="preserve">The missions are slower, about 30 s instead of 12 s, mainly because the policy flies at the 1.04 m/s it was trained at, while PX4 flying straight averages about 1.7 m/s. The network costs about 3.5 s of CPU time per mission with one drone, and the simulation still ran in real time with three drones.</w:t>
+      </w:r>
+    </w:p>
+    <w:p>
+      <w:pPr>
+        <w:rPr/>
+      </w:pPr>
+      <w:r>
+        <w:rPr>
+          <w:rtl w:val="0"/>
+        </w:rPr>
+        <w:t xml:space="preserve">The policy fails more often when more drones are flying: 4% of the drones are destroyed with one drone, 6% with two and 15% with three. None of these crashes happened near another drone. I can think of two reasons, and these results cannot tell them apart. The first is that the mazes with three drones are a different set, because the generator places the obstacles after all the start and target points. The second is that the other drones in the lidar confuse the network, since it was trained with one drone only.</w:t>
+      </w:r>
+    </w:p>
+    <w:p>
+      <w:pPr>
+        <w:rPr/>
+      </w:pPr>
+      <w:r>
+        <w:rPr>
+          <w:rtl w:val="0"/>
+        </w:rPr>
+        <w:t xml:space="preserve">The drones that the policy saves often pass close to an obstacle, with a median closest distance of 0.45 m. The penalty for flying close to an obstacle is small compared to the penalty for a crash, so the policy learned to pass through gaps rather than to keep away from walls.</w:t>
+      </w:r>
+    </w:p>
+    <w:p>
+      <w:pPr>
+        <w:pStyle w:val="Heading2"/>
+        <w:keepNext w:val="0"/>
+        <w:keepLines w:val="0"/>
+        <w:spacing w:after="80" w:lineRule="auto"/>
+        <w:rPr>
+          <w:b w:val="1"/>
+          <w:bCs w:val="1"/>
+          <w:sz w:val="34"/>
+          <w:szCs w:val="34"/>
+        </w:rPr>
+      </w:pPr>
+      <w:r>
+        <w:rPr>
+          <w:b w:val="1"/>
+          <w:bCs w:val="1"/>
+          <w:sz w:val="34"/>
+          <w:szCs w:val="34"/>
+          <w:rtl w:val="0"/>
+        </w:rPr>
         <w:t xml:space="preserve">Next Steps</w:t>
       </w:r>
     </w:p>
@@ -3586,7 +4115,7 @@
         <w:rPr>
           <w:rtl w:val="0"/>
         </w:rPr>
-        <w:t xml:space="preserve">What is left is the avoidance itself. Since PX4 has no 3D planner to install, everything measured so far is the baseline without avoidance, and the contribution of the thesis is the component that closes that gap. The measurement side is already finished, so adding it means changing one thing: the mission node currently sends a setpoint straight at the target, and that is the only place where a path is decided. The comparison would then use the same generator, the same seeds and the same metrics, so the two sets of results can be compared directly. Before starting I want to confirm the approach, because the original plan was to install PX4’s own avoidance system and that is no longer possible.</w:t>
+        <w:t xml:space="preserve">With this comparison the experiments are complete. Possible improvements to the policy would be training with several drones, a larger penalty near obstacles and a higher flight speed. I would like to start writing the thesis with these results, and describe these points as future work.</w:t>
       </w:r>
     </w:p>
     <w:p>

</xml_diff>